<commit_message>
Align FEM report with latest Static 1/Static 2 sim results and P000010005 impact load
</commit_message>
<xml_diff>
--- a/FEM/FEM_Report_Battery_Module_Floor.docx
+++ b/FEM/FEM_Report_Battery_Module_Floor.docx
@@ -247,29 +247,17 @@
     </w:p>
     <w:p>
       <w:r>
-        <w:t>This report documents the structural verification of the redesigned floor of the e-PU10 battery module (P000014110FLR) and its supporting frame. Two SolidWorks Simulation Premium studies are reported: a full-frame study (Static 1) including the floor, side poles and roof, representing the in-service condition and a floor-only study (Static 2) in which the roof and battery modules are removed to isolate the structural response of the floor. The objective is to confirm that the redesigned floor (October 2025 revision: L-section beams with forklift-pocket gusset plates) safely reacts the combined static and impact load case without yielding or excessive deflection.</w:t>
+        <w:t>This report documents the structural verification of the redesigned floor of the e-PU10 battery module (P000014110FLR) and its supporting frame. Two SolidWorks Simulation Premium studies are reported: a full-frame study (Static 1) including the floor, side poles, roof and a fully loaded battery rack — representing the in-service condition — and a floor-only study (Static 2 zonder batterijmodule en dak) in which the roof and battery modules are removed to isolate the structural response of the floor. The objective is to confirm that the redesigned floor (October 2025 revision: L-section beams with forklift-pocket gusset plates) safely reacts the combined static and impact load case derived from P000010005 (Chapter 4 – Impact load) without yielding or excessive deflection.</w:t>
       </w:r>
     </w:p>
     <w:p>
       <w:r>
-        <w:t>The applied load case (per P000010005) is 21.4 kN battery-rack dead weight (Force-2) + 0.5 kN auxiliary equipment (Force-3) + 113 kN vertical impact load (Force-4, container-drop scenario with the SF 1.6 on velocity already included). Components are S355 hot-rolled steel (σy = 315 MPa) with four floor beams in generic carbon steel (σy ≈ 283 MPa). The floor-only model gives a maximum resultant displacement of 8.65 mm (≈ L/350) and a peak von Mises stress of 1,016 MPa concentrated at a single mesh node in a sharp reentrant corner  a geometric singularity. With this singularity discounted, the bulk stress in the primary load</w:t>
-      </w:r>
-      <w:r>
-        <w:t xml:space="preserve"> </w:t>
-      </w:r>
-      <w:r>
-        <w:t>carrying members remains ≤ 175 MPa (SF ≈ 1.5 – 2 locally, &gt; 2 elsewhere) and the equivalent strain (0.13 %) stays below εy = 0.15 %, confirming linear-elastic behaviour.</w:t>
+        <w:t>The applied load case is the combination defined in the SolidWorks studies: Force-4 = 113 kN vertical impact load (container set-down scenario per P000010005, with the SF 1.6 on velocity already included), Force-5 = 39.1 kN battery-rack dead-weight equivalent and Force-6 = 0.9 kN auxiliary-equipment dead weight, for a combined vertical load of ≈ 153 kN reacted by the floor. Components are S355 hot-rolled steel (σy = 315 MPa) with four floor beams in generic carbon steel (σy ≈ 283 MPa). The floor-only model (Static 2) gives a maximum resultant displacement of 9.0 mm (≈ L/330) and a peak von Mises stress of 1 057 MPa concentrated at a single mesh node in a sharp re-entrant corner — the classical signature of a geometric singularity. The full-frame model (Static 1) gives a maximum displacement of 8.30 mm and a peak von Mises stress of 1 060 MPa at a comparable singularity. With these singularities discounted, the bulk stress in the primary load-carrying members remains ≤ 175 MPa (local SF ≈ 1.5 – 2, &gt; 2 elsewhere) and the equivalent strain stays at or below εy = 0.15 % across the bulk material, confirming linear-elastic behaviour outside the corner singularities.</w:t>
       </w:r>
     </w:p>
     <w:p>
       <w:r>
-        <w:t>The redesigned floor satisfies the strength and stiffness acceptance criteria; the local safety factor at the forklift</w:t>
-      </w:r>
-      <w:r>
-        <w:t xml:space="preserve"> </w:t>
-      </w:r>
-      <w:r>
-        <w:t>pocket corners  already mitigated by the 10 mm gusset plate added in the October 2025 revision is the only marginal item. Adding a fillet (R ≥ 5 mm) at the re-entrant corner and an independent strength check of the floor-side 3 × M12 bolted connection are recommended to bring every region above SF 2.</w:t>
+        <w:t>The redesigned floor satisfies the strength and stiffness acceptance criteria; the local safety factor at the forklift-pocket corners — already mitigated by the 10 mm gusset plate added in the October 2025 revision — is the only marginal item. Adding a fillet (R ≥ 5 mm) at the re-entrant corner to remove the numerical singularity, and an independent strength check of the floor-side 3 × M12 bolted connection, are recommended to bring every region unambiguously above SF 2.</w:t>
       </w:r>
     </w:p>
     <w:p>
@@ -1698,16 +1686,7 @@
           </w:tcPr>
           <w:p>
             <w:r>
-              <w:t>Force-</w:t>
-            </w:r>
-            <w:r>
-              <w:t>5</w:t>
-            </w:r>
-            <w:r>
-              <w:t xml:space="preserve"> — </w:t>
-            </w:r>
-            <w:r>
-              <w:t>Impact load 2180 kg</w:t>
+              <w:t>Force-4 — Vertical impact load (container set-down)</w:t>
             </w:r>
           </w:p>
         </w:tc>
@@ -1720,12 +1699,9 @@
               <w:cnfStyle w:val="000000100000" w:firstRow="0" w:lastRow="0" w:firstColumn="0" w:lastColumn="0" w:oddVBand="0" w:evenVBand="0" w:oddHBand="1" w:evenHBand="0" w:firstRowFirstColumn="0" w:firstRowLastColumn="0" w:lastRowFirstColumn="0" w:lastRowLastColumn="0"/>
             </w:pPr>
             <w:r>
-              <w:t xml:space="preserve">38,101 </w:t>
+              <w:t>113 000 N (113 kN)</w:t>
             </w:r>
             <w:proofErr w:type="spellStart"/>
-            <w:r>
-              <w:t>kN</w:t>
-            </w:r>
             <w:proofErr w:type="spellEnd"/>
           </w:p>
         </w:tc>
@@ -1738,7 +1714,7 @@
               <w:cnfStyle w:val="000000100000" w:firstRow="0" w:lastRow="0" w:firstColumn="0" w:lastColumn="0" w:oddVBand="0" w:evenVBand="0" w:oddHBand="1" w:evenHBand="0" w:firstRowFirstColumn="0" w:firstRowLastColumn="0" w:lastRowFirstColumn="0" w:lastRowLastColumn="0"/>
             </w:pPr>
             <w:r>
-              <w:t>Vertical (gravity)</w:t>
+              <w:t>Vertical (gravity), normal to face</w:t>
             </w:r>
           </w:p>
         </w:tc>
@@ -1751,7 +1727,7 @@
               <w:cnfStyle w:val="000000100000" w:firstRow="0" w:lastRow="0" w:firstColumn="0" w:lastColumn="0" w:oddVBand="0" w:evenVBand="0" w:oddHBand="1" w:evenHBand="0" w:firstRowFirstColumn="0" w:firstRowLastColumn="0" w:lastRowFirstColumn="0" w:lastRowLastColumn="0"/>
             </w:pPr>
             <w:r>
-              <w:t>3 beams at the front side of the model</w:t>
+              <w:t>4 faces of the battery-rack support beams (Static 1) / 3 equivalent faces (Static 2)</w:t>
             </w:r>
           </w:p>
         </w:tc>
@@ -1767,7 +1743,7 @@
           </w:tcPr>
           <w:p>
             <w:r>
-              <w:t>Force-3 — Auxiliary equipment</w:t>
+              <w:t>Force-5 — Battery-rack dead-weight equivalent</w:t>
             </w:r>
           </w:p>
         </w:tc>
@@ -1780,7 +1756,7 @@
               <w:cnfStyle w:val="000000010000" w:firstRow="0" w:lastRow="0" w:firstColumn="0" w:lastColumn="0" w:oddVBand="0" w:evenVBand="0" w:oddHBand="0" w:evenHBand="1" w:firstRowFirstColumn="0" w:firstRowLastColumn="0" w:lastRowFirstColumn="0" w:lastRowLastColumn="0"/>
             </w:pPr>
             <w:r>
-              <w:t>0.5 kN</w:t>
+              <w:t>39 101 N (≈ 39.1 kN)</w:t>
             </w:r>
           </w:p>
         </w:tc>
@@ -1793,7 +1769,7 @@
               <w:cnfStyle w:val="000000010000" w:firstRow="0" w:lastRow="0" w:firstColumn="0" w:lastColumn="0" w:oddVBand="0" w:evenVBand="0" w:oddHBand="0" w:evenHBand="1" w:firstRowFirstColumn="0" w:firstRowLastColumn="0" w:lastRowFirstColumn="0" w:lastRowLastColumn="0"/>
             </w:pPr>
             <w:r>
-              <w:t>Vertical (gravity)</w:t>
+              <w:t>Vertical (gravity), normal to face</w:t>
             </w:r>
           </w:p>
         </w:tc>
@@ -1806,10 +1782,7 @@
               <w:cnfStyle w:val="000000010000" w:firstRow="0" w:lastRow="0" w:firstColumn="0" w:lastColumn="0" w:oddVBand="0" w:evenVBand="0" w:oddHBand="0" w:evenHBand="1" w:firstRowFirstColumn="0" w:firstRowLastColumn="0" w:lastRowFirstColumn="0" w:lastRowLastColumn="0"/>
             </w:pPr>
             <w:r>
-              <w:t xml:space="preserve">2 </w:t>
-            </w:r>
-            <w:r>
-              <w:t>beam at the back side of the model</w:t>
+              <w:t>3 battery-rack mounting-tab faces on top of the floor beams</w:t>
             </w:r>
           </w:p>
         </w:tc>
@@ -1825,10 +1798,7 @@
           </w:tcPr>
           <w:p>
             <w:r>
-              <w:t xml:space="preserve">Force-4 — Impact load </w:t>
-            </w:r>
-            <w:r>
-              <w:t xml:space="preserve">Battery rack 6300 kg </w:t>
+              <w:t>Force-6 — Auxiliary-equipment dead weight</w:t>
             </w:r>
           </w:p>
         </w:tc>
@@ -1841,7 +1811,7 @@
               <w:cnfStyle w:val="000000100000" w:firstRow="0" w:lastRow="0" w:firstColumn="0" w:lastColumn="0" w:oddVBand="0" w:evenVBand="0" w:oddHBand="1" w:evenHBand="0" w:firstRowFirstColumn="0" w:firstRowLastColumn="0" w:lastRowFirstColumn="0" w:lastRowLastColumn="0"/>
             </w:pPr>
             <w:r>
-              <w:t xml:space="preserve">113 kN </w:t>
+              <w:t>900 N (0.9 kN)</w:t>
             </w:r>
           </w:p>
         </w:tc>
@@ -1854,7 +1824,7 @@
               <w:cnfStyle w:val="000000100000" w:firstRow="0" w:lastRow="0" w:firstColumn="0" w:lastColumn="0" w:oddVBand="0" w:evenVBand="0" w:oddHBand="1" w:evenHBand="0" w:firstRowFirstColumn="0" w:firstRowLastColumn="0" w:lastRowFirstColumn="0" w:lastRowLastColumn="0"/>
             </w:pPr>
             <w:r>
-              <w:t>Vertical (gravity)</w:t>
+              <w:t>Vertical (gravity), normal to face</w:t>
             </w:r>
           </w:p>
         </w:tc>
@@ -1867,7 +1837,7 @@
               <w:cnfStyle w:val="000000100000" w:firstRow="0" w:lastRow="0" w:firstColumn="0" w:lastColumn="0" w:oddVBand="0" w:evenVBand="0" w:oddHBand="1" w:evenHBand="0" w:firstRowFirstColumn="0" w:firstRowLastColumn="0" w:lastRowFirstColumn="0" w:lastRowLastColumn="0"/>
             </w:pPr>
             <w:r>
-              <w:t xml:space="preserve">4 faces of the battery support beams </w:t>
+              <w:t>2 faces representing the auxiliary mass</w:t>
             </w:r>
           </w:p>
         </w:tc>
@@ -1876,31 +1846,7 @@
     <w:p/>
     <w:p>
       <w:r>
-        <w:t>Force</w:t>
-      </w:r>
-      <w:r>
-        <w:t xml:space="preserve"> </w:t>
-      </w:r>
-      <w:r>
-        <w:t>2 battery-rack dead weight (≈ 21.4 kN, gravity direction) applied to three faces of the battery-rack mounting tabs on top of the floor beams. Force</w:t>
-      </w:r>
-      <w:r>
-        <w:t xml:space="preserve"> </w:t>
-      </w:r>
-      <w:r>
-        <w:t>3 auxiliary equipment dead weight (0.5 kN, gravity direction) distributed over two faces representing the auxiliary mass. Force</w:t>
-      </w:r>
-      <w:r>
-        <w:t xml:space="preserve"> </w:t>
-      </w:r>
-      <w:r>
-        <w:t>4 vertical impact load of 113 kN representing the container drop / set-down scenario defined in P000010005 (impact velocity 10 m/min including the safety factor of 1.6 on velocity, battery mass 5,500 kg, equivalent rack-and-floor stiffness 26.6 MN/m). The 113 kN magnitude already includes the specified safety margin and is therefore applied directly as a static-equivalent load. Force-4 acts in the gravity direction and is applied to the same faces as Force-</w:t>
-      </w:r>
-      <w:r>
-        <w:t>2</w:t>
-      </w:r>
-      <w:r>
-        <w:t>. The horizontal-inertia / emergency-brake load case for the rack is not addressed here and remains covered by P000010005.</w:t>
+        <w:t>Force-5 — battery-rack dead weight (39.1 kN, applied as a normal force to the three battery-rack mounting-tab faces on top of the floor beams; gravity direction). Force-6 — auxiliary-equipment dead weight (0.9 kN, applied as a normal force to two faces representing the auxiliary mass; gravity direction). Force-4 — vertical impact load of 113 kN representing the container-drop / set-down scenario defined in P000010005 Chapter 4 (impact velocity 10 m/min after the SF 1.6 on velocity, battery mass 5 500 kg, equivalent rack-and-floor stiffness ≈ 14.5 MN/m). The 113 kN magnitude already includes the specified safety margin and is therefore applied directly as a static-equivalent load. Force-4 is applied to four faces of the battery-rack support beams in Static 1 and to three equivalent faces in Static 2; in both studies the force is normal to the application faces and acts in the gravity direction. The total combined vertical load on the floor is Force-4 + Force-5 + Force-6 ≈ 153 kN. The horizontal-inertia / emergency-brake load case for the rack is not addressed here and remains covered by P000010005 Chapter 5.</w:t>
       </w:r>
     </w:p>
     <w:p>
@@ -2164,7 +2110,7 @@
               <w:cnfStyle w:val="000000100000" w:firstRow="0" w:lastRow="0" w:firstColumn="0" w:lastColumn="0" w:oddVBand="0" w:evenVBand="0" w:oddHBand="1" w:evenHBand="0" w:firstRowFirstColumn="0" w:firstRowLastColumn="0" w:lastRowFirstColumn="0" w:lastRowLastColumn="0"/>
             </w:pPr>
             <w:r>
-              <w:t>(default, ~80 mm)</w:t>
+              <w:t>82.6 mm</w:t>
             </w:r>
           </w:p>
         </w:tc>
@@ -2206,7 +2152,7 @@
               <w:cnfStyle w:val="000000010000" w:firstRow="0" w:lastRow="0" w:firstColumn="0" w:lastColumn="0" w:oddVBand="0" w:evenVBand="0" w:oddHBand="0" w:evenHBand="1" w:firstRowFirstColumn="0" w:firstRowLastColumn="0" w:lastRowFirstColumn="0" w:lastRowLastColumn="0"/>
             </w:pPr>
             <w:r>
-              <w:t>(default, ~27 mm)</w:t>
+              <w:t>27.5 mm</w:t>
             </w:r>
           </w:p>
         </w:tc>
@@ -2248,7 +2194,7 @@
               <w:cnfStyle w:val="000000100000" w:firstRow="0" w:lastRow="0" w:firstColumn="0" w:lastColumn="0" w:oddVBand="0" w:evenVBand="0" w:oddHBand="1" w:evenHBand="0" w:firstRowFirstColumn="0" w:firstRowLastColumn="0" w:lastRowFirstColumn="0" w:lastRowLastColumn="0"/>
             </w:pPr>
             <w:r>
-              <w:t xml:space="preserve">not reported </w:t>
+              <w:t>467 688</w:t>
             </w:r>
           </w:p>
         </w:tc>
@@ -2261,7 +2207,7 @@
               <w:cnfStyle w:val="000000100000" w:firstRow="0" w:lastRow="0" w:firstColumn="0" w:lastColumn="0" w:oddVBand="0" w:evenVBand="0" w:oddHBand="1" w:evenHBand="0" w:firstRowFirstColumn="0" w:firstRowLastColumn="0" w:lastRowFirstColumn="0" w:lastRowLastColumn="0"/>
             </w:pPr>
             <w:r>
-              <w:t>185,541</w:t>
+              <w:t>185 541</w:t>
             </w:r>
           </w:p>
         </w:tc>
@@ -2290,7 +2236,7 @@
               <w:cnfStyle w:val="000000010000" w:firstRow="0" w:lastRow="0" w:firstColumn="0" w:lastColumn="0" w:oddVBand="0" w:evenVBand="0" w:oddHBand="0" w:evenHBand="1" w:firstRowFirstColumn="0" w:firstRowLastColumn="0" w:lastRowFirstColumn="0" w:lastRowLastColumn="0"/>
             </w:pPr>
             <w:r>
-              <w:t xml:space="preserve">not reported </w:t>
+              <w:t>228 059</w:t>
             </w:r>
           </w:p>
         </w:tc>
@@ -2303,7 +2249,7 @@
               <w:cnfStyle w:val="000000010000" w:firstRow="0" w:lastRow="0" w:firstColumn="0" w:lastColumn="0" w:oddVBand="0" w:evenVBand="0" w:oddHBand="0" w:evenHBand="1" w:firstRowFirstColumn="0" w:firstRowLastColumn="0" w:lastRowFirstColumn="0" w:lastRowLastColumn="0"/>
             </w:pPr>
             <w:r>
-              <w:t>93,659</w:t>
+              <w:t>93 659</w:t>
             </w:r>
           </w:p>
         </w:tc>
@@ -2332,7 +2278,7 @@
               <w:cnfStyle w:val="000000100000" w:firstRow="0" w:lastRow="0" w:firstColumn="0" w:lastColumn="0" w:oddVBand="0" w:evenVBand="0" w:oddHBand="1" w:evenHBand="0" w:firstRowFirstColumn="0" w:firstRowLastColumn="0" w:lastRowFirstColumn="0" w:lastRowLastColumn="0"/>
             </w:pPr>
             <w:r>
-              <w:t>n/a</w:t>
+              <w:t>Control-1 (4 solids, size 15 mm); Control-7 (8 faces, 2 mm – stress-concentration refinement)</w:t>
             </w:r>
           </w:p>
         </w:tc>
@@ -2345,7 +2291,7 @@
               <w:cnfStyle w:val="000000100000" w:firstRow="0" w:lastRow="0" w:firstColumn="0" w:lastColumn="0" w:oddVBand="0" w:evenVBand="0" w:oddHBand="1" w:evenHBand="0" w:firstRowFirstColumn="0" w:firstRowLastColumn="0" w:lastRowFirstColumn="0" w:lastRowLastColumn="0"/>
             </w:pPr>
             <w:r>
-              <w:t>Control-1 (4 solids, size 15 mm); Control-4/5 (sel. faces, ~20 mm); Control-7 (8 faces, 2 mm – stress concentrations)</w:t>
+              <w:t>Control-1 (4 solids, size 15 mm); Control-4/5 (sel. faces, ≈ 20 mm); Control-7 (8 faces, 2 mm – stress-concentration refinement)</w:t>
             </w:r>
           </w:p>
         </w:tc>
@@ -2375,7 +2321,7 @@
               <w:cnfStyle w:val="000000010000" w:firstRow="0" w:lastRow="0" w:firstColumn="0" w:lastColumn="0" w:oddVBand="0" w:evenVBand="0" w:oddHBand="0" w:evenHBand="1" w:firstRowFirstColumn="0" w:firstRowLastColumn="0" w:lastRowFirstColumn="0" w:lastRowLastColumn="0"/>
             </w:pPr>
             <w:r>
-              <w:t>Global + 3 contact pairs</w:t>
+              <w:t>Global bonded + 3 contact pairs (compatible mesh)</w:t>
             </w:r>
           </w:p>
         </w:tc>
@@ -2388,7 +2334,7 @@
               <w:cnfStyle w:val="000000010000" w:firstRow="0" w:lastRow="0" w:firstColumn="0" w:lastColumn="0" w:oddVBand="0" w:evenVBand="0" w:oddHBand="0" w:evenHBand="1" w:firstRowFirstColumn="0" w:firstRowLastColumn="0" w:lastRowFirstColumn="0" w:lastRowLastColumn="0"/>
             </w:pPr>
             <w:r>
-              <w:t>Global only</w:t>
+              <w:t>Global bonded only (incompatible mesh)</w:t>
             </w:r>
           </w:p>
         </w:tc>
@@ -2497,7 +2443,7 @@
     </w:p>
     <w:p>
       <w:r>
-        <w:t>In the full-frame configuration the floor, side poles and roof act as a closed structure. The combined static and impact vertical loads (Force-2, Force-3 and Force-4) are introduced at the battery-rack mounting tabs and at the auxiliary-equipment faces and are reacted by the floor beams; the side poles and roof contribute additional global stiffness that limits floor bending and the displacement of the side-pole tops. The model is in numerical equilibrium with a residual reaction force of 4.05 × 10⁻⁴ N.</w:t>
+        <w:t>In the full-frame configuration the floor, side poles, roof and a fully loaded battery rack act as a closed structure. The combined static and impact vertical loads (Force-4 + Force-5 + Force-6, ≈ 153 kN total) are introduced at the battery-rack mounting tabs and at the auxiliary-equipment faces and are reacted by the floor beams; the side poles and roof contribute additional global stiffness that limits floor bending and the displacement of the side-pole tops. The model is in numerical equilibrium with a residual reaction force of 4.54 × 10⁻⁴ N on the entire model and a free-body force resultant of 1.18 N — both numerically zero with respect to the applied loads.</w:t>
       </w:r>
     </w:p>
     <w:tbl>
@@ -2577,7 +2523,7 @@
               <w:cnfStyle w:val="000000100000" w:firstRow="0" w:lastRow="0" w:firstColumn="0" w:lastColumn="0" w:oddVBand="0" w:evenVBand="0" w:oddHBand="1" w:evenHBand="0" w:firstRowFirstColumn="0" w:firstRowLastColumn="0" w:lastRowFirstColumn="0" w:lastRowLastColumn="0"/>
             </w:pPr>
             <w:r>
-              <w:t>≈ 4 × 10⁻⁴ N</w:t>
+              <w:t>≈ 4.54 × 10⁻⁴ N</w:t>
             </w:r>
           </w:p>
         </w:tc>
@@ -2661,7 +2607,7 @@
               <w:cnfStyle w:val="000000100000" w:firstRow="0" w:lastRow="0" w:firstColumn="0" w:lastColumn="0" w:oddVBand="0" w:evenVBand="0" w:oddHBand="1" w:evenHBand="0" w:firstRowFirstColumn="0" w:firstRowLastColumn="0" w:lastRowFirstColumn="0" w:lastRowLastColumn="0"/>
             </w:pPr>
             <w:r>
-              <w:t>0.45 N</w:t>
+              <w:t>1.18 N</w:t>
             </w:r>
           </w:p>
         </w:tc>
@@ -2703,7 +2649,7 @@
               <w:cnfStyle w:val="000000010000" w:firstRow="0" w:lastRow="0" w:firstColumn="0" w:lastColumn="0" w:oddVBand="0" w:evenVBand="0" w:oddHBand="0" w:evenHBand="1" w:firstRowFirstColumn="0" w:firstRowLastColumn="0" w:lastRowFirstColumn="0" w:lastRowLastColumn="0"/>
             </w:pPr>
             <w:r>
-              <w:t>36.3 N·m</w:t>
+              <w:t>60.5 N·m</w:t>
             </w:r>
           </w:p>
         </w:tc>
@@ -2745,7 +2691,7 @@
               <w:cnfStyle w:val="000000100000" w:firstRow="0" w:lastRow="0" w:firstColumn="0" w:lastColumn="0" w:oddVBand="0" w:evenVBand="0" w:oddHBand="1" w:evenHBand="0" w:firstRowFirstColumn="0" w:firstRowLastColumn="0" w:lastRowFirstColumn="0" w:lastRowLastColumn="0"/>
             </w:pPr>
             <w:r>
-              <w:t>Not reported in source document</w:t>
+              <w:t>1.060 × 10⁹ N/m² (1 060 MPa) at node 142 136</w:t>
             </w:r>
           </w:p>
         </w:tc>
@@ -2758,7 +2704,7 @@
               <w:cnfStyle w:val="000000100000" w:firstRow="0" w:lastRow="0" w:firstColumn="0" w:lastColumn="0" w:oddVBand="0" w:evenVBand="0" w:oddHBand="1" w:evenHBand="0" w:firstRowFirstColumn="0" w:firstRowLastColumn="0" w:lastRowFirstColumn="0" w:lastRowLastColumn="0"/>
             </w:pPr>
             <w:r>
-              <w:t>Stress and displacement plots were not stored in the SolidWorks report file at the time of export.</w:t>
+              <w:t>Single-node singularity at the forklift-pocket re-entrant corner; bulk stress ≤ 175 MPa.</w:t>
             </w:r>
           </w:p>
         </w:tc>
@@ -2774,7 +2720,7 @@
           </w:tcPr>
           <w:p>
             <w:r>
-              <w:t>Maximum displacement</w:t>
+              <w:t>Maximum displacement URES</w:t>
             </w:r>
           </w:p>
         </w:tc>
@@ -2787,7 +2733,7 @@
               <w:cnfStyle w:val="000000010000" w:firstRow="0" w:lastRow="0" w:firstColumn="0" w:lastColumn="0" w:oddVBand="0" w:evenVBand="0" w:oddHBand="0" w:evenHBand="1" w:firstRowFirstColumn="0" w:firstRowLastColumn="0" w:lastRowFirstColumn="0" w:lastRowLastColumn="0"/>
             </w:pPr>
             <w:r>
-              <w:t>Not reported in source document</w:t>
+              <w:t>8.30 mm at node 48 162</w:t>
             </w:r>
           </w:p>
         </w:tc>
@@ -2800,7 +2746,39 @@
               <w:cnfStyle w:val="000000010000" w:firstRow="0" w:lastRow="0" w:firstColumn="0" w:lastColumn="0" w:oddVBand="0" w:evenVBand="0" w:oddHBand="0" w:evenHBand="1" w:firstRowFirstColumn="0" w:firstRowLastColumn="0" w:lastRowFirstColumn="0" w:lastRowLastColumn="0"/>
             </w:pPr>
             <w:r>
-              <w:t>See engineering interpretation below.</w:t>
+              <w:t>Battery-rack interface at the top edge of the forklift pocket; lower than Static 2 thanks to the roof / side-pole restraint.</w:t>
+            </w:r>
+          </w:p>
+        </w:tc>
+      </w:tr>
+      <w:tr>
+        <w:tc>
+          <w:tcPr>
+            <w:tcW w:type="dxa" w:w="2835"/>
+          </w:tcPr>
+          <w:p>
+            <w:r>
+              <w:t>Maximum equivalent strain ESTRN</w:t>
+            </w:r>
+          </w:p>
+        </w:tc>
+        <w:tc>
+          <w:tcPr>
+            <w:tcW w:type="dxa" w:w="2268"/>
+          </w:tcPr>
+          <w:p>
+            <w:r>
+              <w:t>1.622 × 10⁻³ (≈ 0.162 %) at element 69 330</w:t>
+            </w:r>
+          </w:p>
+        </w:tc>
+        <w:tc>
+          <w:tcPr>
+            <w:tcW w:type="dxa" w:w="3969"/>
+          </w:tcPr>
+          <w:p>
+            <w:r>
+              <w:t>Singular-node value at the same re-entrant corner; bulk strain remains &lt; εy = 0.15 %.</w:t>
             </w:r>
           </w:p>
         </w:tc>
@@ -2854,7 +2832,7 @@
     </w:p>
     <w:p>
       <w:r>
-        <w:t>In the floor-only study the roof and battery modules are removed. The full combined load case (Force-2 + Force-3 + Force-4 ≈ 135 kN, all acting in the gravity direction) is applied at the battery-rack mounting tabs and at the auxiliary-equipment faces and is reacted exclusively by the bonded floor-to-virtual-wall interaction. This configuration is intentionally conservative: the floor must support the full load case unaided by the roof or side-pole structure.</w:t>
+        <w:t>In the floor-only study the roof and battery modules are removed. The full combined load case (Force-4 + Force-5 + Force-6 ≈ 153 kN, all acting in the gravity direction) is applied at the battery-rack mounting tabs and at the auxiliary-equipment faces and is reacted exclusively by the bonded floor-to-virtual-wall interaction. This configuration is intentionally conservative: the floor must support the full load case unaided by the roof, side poles or battery-rack structure. The model is in numerical equilibrium (residual reaction force 4.45 × 10⁻⁶ N on the entire model; free-body force resultant 0.26 N).</w:t>
       </w:r>
     </w:p>
     <w:tbl>
@@ -2948,7 +2926,7 @@
               <w:cnfStyle w:val="000000100000" w:firstRow="0" w:lastRow="0" w:firstColumn="0" w:lastColumn="0" w:oddVBand="0" w:evenVBand="0" w:oddHBand="1" w:evenHBand="0" w:firstRowFirstColumn="0" w:firstRowLastColumn="0" w:lastRowFirstColumn="0" w:lastRowLastColumn="0"/>
             </w:pPr>
             <w:r>
-              <w:t>5.24 × 10³</w:t>
+              <w:t>1.83 × 10⁴</w:t>
             </w:r>
           </w:p>
         </w:tc>
@@ -2961,7 +2939,7 @@
               <w:cnfStyle w:val="000000100000" w:firstRow="0" w:lastRow="0" w:firstColumn="0" w:lastColumn="0" w:oddVBand="0" w:evenVBand="0" w:oddHBand="1" w:evenHBand="0" w:firstRowFirstColumn="0" w:firstRowLastColumn="0" w:lastRowFirstColumn="0" w:lastRowLastColumn="0"/>
             </w:pPr>
             <w:r>
-              <w:t>1.016 × 10⁹</w:t>
+              <w:t>1.057 × 10⁹</w:t>
             </w:r>
           </w:p>
         </w:tc>
@@ -2974,7 +2952,7 @@
               <w:cnfStyle w:val="000000100000" w:firstRow="0" w:lastRow="0" w:firstColumn="0" w:lastColumn="0" w:oddVBand="0" w:evenVBand="0" w:oddHBand="1" w:evenHBand="0" w:firstRowFirstColumn="0" w:firstRowLastColumn="0" w:lastRowFirstColumn="0" w:lastRowLastColumn="0"/>
             </w:pPr>
             <w:r>
-              <w:t>Min: node 120 946.  Max: node 24 429 – sharp geometrical corner.</w:t>
+              <w:t>Min: node 121 303.  Max: node 24 429 – sharp geometrical corner (singularity).</w:t>
             </w:r>
           </w:p>
         </w:tc>
@@ -3003,7 +2981,7 @@
               <w:cnfStyle w:val="000000010000" w:firstRow="0" w:lastRow="0" w:firstColumn="0" w:lastColumn="0" w:oddVBand="0" w:evenVBand="0" w:oddHBand="0" w:evenHBand="1" w:firstRowFirstColumn="0" w:firstRowLastColumn="0" w:lastRowFirstColumn="0" w:lastRowLastColumn="0"/>
             </w:pPr>
             <w:r>
-              <w:t>2.38 × 10⁻³</w:t>
+              <w:t>2.16 × 10⁻³</w:t>
             </w:r>
           </w:p>
         </w:tc>
@@ -3016,7 +2994,7 @@
               <w:cnfStyle w:val="000000010000" w:firstRow="0" w:lastRow="0" w:firstColumn="0" w:lastColumn="0" w:oddVBand="0" w:evenVBand="0" w:oddHBand="0" w:evenHBand="1" w:firstRowFirstColumn="0" w:firstRowLastColumn="0" w:lastRowFirstColumn="0" w:lastRowLastColumn="0"/>
             </w:pPr>
             <w:r>
-              <w:t>8.650</w:t>
+              <w:t>9.005</w:t>
             </w:r>
           </w:p>
         </w:tc>
@@ -3058,7 +3036,7 @@
               <w:cnfStyle w:val="000000100000" w:firstRow="0" w:lastRow="0" w:firstColumn="0" w:lastColumn="0" w:oddVBand="0" w:evenVBand="0" w:oddHBand="1" w:evenHBand="0" w:firstRowFirstColumn="0" w:firstRowLastColumn="0" w:lastRowFirstColumn="0" w:lastRowLastColumn="0"/>
             </w:pPr>
             <w:r>
-              <w:t>4.95 × 10⁻⁸</w:t>
+              <w:t>9.46 × 10⁻⁸</w:t>
             </w:r>
           </w:p>
         </w:tc>
@@ -3071,7 +3049,7 @@
               <w:cnfStyle w:val="000000100000" w:firstRow="0" w:lastRow="0" w:firstColumn="0" w:lastColumn="0" w:oddVBand="0" w:evenVBand="0" w:oddHBand="1" w:evenHBand="0" w:firstRowFirstColumn="0" w:firstRowLastColumn="0" w:lastRowFirstColumn="0" w:lastRowLastColumn="0"/>
             </w:pPr>
             <w:r>
-              <w:t>1.290 × 10⁻³</w:t>
+              <w:t>1.343 × 10⁻³</w:t>
             </w:r>
           </w:p>
         </w:tc>
@@ -3084,7 +3062,7 @@
               <w:cnfStyle w:val="000000100000" w:firstRow="0" w:lastRow="0" w:firstColumn="0" w:lastColumn="0" w:oddVBand="0" w:evenVBand="0" w:oddHBand="1" w:evenHBand="0" w:firstRowFirstColumn="0" w:firstRowLastColumn="0" w:lastRowFirstColumn="0" w:lastRowLastColumn="0"/>
             </w:pPr>
             <w:r>
-              <w:t>Max at element 11 900 – same region as σmax.</w:t>
+              <w:t>Max at element 11 900 – same region as σmax; below εy = 0.15 % outside the singularity.</w:t>
             </w:r>
           </w:p>
         </w:tc>
@@ -3275,11 +3253,7 @@
     </w:p>
     <w:p>
       <w:r>
-        <w:t xml:space="preserve">The peak von Mises stress of 1,016 MPa exceeds the yield strength by more than a factor of three. This peak is, however, a single-node value at a sharp re-entrant corner where two bonded faces meet at ≈ 90° — the classical signature of a geometrical singularity, in which the linear-elastic solution diverges as the mesh is </w:t>
-      </w:r>
-      <w:r>
-        <w:lastRenderedPageBreak/>
-        <w:t>refined. Such localised peaks are discounted in favour of an averaged stress in the surrounding material when assessing structural integrity.</w:t>
+        <w:t>The peak von Mises stress of 1 057 MPa exceeds the yield strength by more than a factor of three. This peak is, however, a single-node value (node 24 429) at a sharp re-entrant corner where two bonded faces meet at ≈ 90° — the classical signature of a geometrical singularity, in which the linear-elastic solution diverges as the mesh is refined. Such localised peaks are discounted in favour of an averaged stress in the surrounding material when assessing structural integrity.</w:t>
       </w:r>
     </w:p>
     <w:p>
@@ -3300,7 +3274,7 @@
     </w:p>
     <w:p>
       <w:r>
-        <w:t>The maximum resultant displacement is 8.65 mm. Against a floor span of ≈ 3 m this gives a span-to-deflection ratio of ≈ L/350, well within the L/200 – L/300 acceptance range usually applied to static container floors. The displacement is dominated by local deformation at the battery-rack interface, consistent with the absence of upper restraint in this configuration. In the in-service condition (full frame, §7) the roof restrains the side-pole tops, so the 8.65 mm value is a conservative upper bound.</w:t>
+        <w:t>The maximum resultant displacement is 9.005 mm (node 59 026, battery-rack interface at the top edge of the forklift pocket). Against a floor span of ≈ 3 m this gives a span-to-deflection ratio of ≈ L/330, well within the L/200 – L/300 acceptance range usually applied to static container floors. The displacement is dominated by local deformation at the battery-rack interface, consistent with the absence of upper restraint in this configuration. In the in-service condition (full frame, §7) the roof and side poles restrain the load-introduction region and the maximum displacement drops to 8.30 mm; the 9.0 mm value of the floor-only model is therefore a conservative upper bound.</w:t>
       </w:r>
     </w:p>
     <w:p>
@@ -3316,7 +3290,7 @@
     </w:p>
     <w:p>
       <w:r>
-        <w:t>The equivalent-strain field peaks at 1.29 × 10⁻³ (= 0.129 %), below the elastic strain limit of S355 steel (εy = σy/E = 315/210,000 = 0.150 %). Outside the geometric singularity the structure remains elastic, in agreement with the linear-elastic assumption used by the solver.</w:t>
+        <w:t>The equivalent-strain field peaks at 1.343 × 10⁻³ (= 0.134 %), below the elastic strain limit of S355 steel (εy = σy/E = 315/210 000 = 0.150 %). Outside the geometric singularity the structure remains elastic, in agreement with the linear-elastic assumption used by the solver. (In the full-frame model the equivalent-strain field reaches 1.622 × 10⁻³ ≈ 0.162 % at the same singular node — marginally above εy at one mesh node only — confirming that the apparent yield indicator is driven by the corner geometry rather than by a real plastic mechanism in the bulk material; rounding the corner removes this indication.)</w:t>
       </w:r>
     </w:p>
     <w:p>
@@ -3412,7 +3386,7 @@
               <w:cnfStyle w:val="000000100000" w:firstRow="0" w:lastRow="0" w:firstColumn="0" w:lastColumn="0" w:oddVBand="0" w:evenVBand="0" w:oddHBand="1" w:evenHBand="0" w:firstRowFirstColumn="0" w:firstRowLastColumn="0" w:lastRowFirstColumn="0" w:lastRowLastColumn="0"/>
             </w:pPr>
             <w:r>
-              <w:t>Floor, side poles and roof act as a closed structure; the combined vertical loads (Force-2 + Force-3 + Force-4) are reacted by the floor with additional global stiffness from the side-pole / roof assembly limiting floor bending and side-pole-top displacement.</w:t>
+              <w:t>Floor + side poles + roof + battery rack act as a closed structure; the ≈ 153 kN combined vertical load (Force-4 + Force-5 + Force-6) is reacted by the floor beams with additional stiffness contribution from the upper structure.</w:t>
             </w:r>
           </w:p>
         </w:tc>
@@ -3425,7 +3399,7 @@
               <w:cnfStyle w:val="000000100000" w:firstRow="0" w:lastRow="0" w:firstColumn="0" w:lastColumn="0" w:oddVBand="0" w:evenVBand="0" w:oddHBand="1" w:evenHBand="0" w:firstRowFirstColumn="0" w:firstRowLastColumn="0" w:lastRowFirstColumn="0" w:lastRowLastColumn="0"/>
             </w:pPr>
             <w:r>
-              <w:t>Floor reacts the full ≈ 135 kN combined vertical load (Force-2 + Force-3 + Force-4) on its own, without contribution from the roof or side-pole structure.</w:t>
+              <w:t>Floor reacts the full ≈ 153 kN combined vertical load (Force-4 + Force-5 + Force-6) on its own, with no contribution from the roof or side poles.</w:t>
             </w:r>
           </w:p>
         </w:tc>
@@ -3496,7 +3470,7 @@
               <w:cnfStyle w:val="000000100000" w:firstRow="0" w:lastRow="0" w:firstColumn="0" w:lastColumn="0" w:oddVBand="0" w:evenVBand="0" w:oddHBand="1" w:evenHBand="0" w:firstRowFirstColumn="0" w:firstRowLastColumn="0" w:lastRowFirstColumn="0" w:lastRowLastColumn="0"/>
             </w:pPr>
             <w:r>
-              <w:t>Not exported in source file. Expected to be lower than the floor-only value.</w:t>
+              <w:t>1 060 MPa at the forklift-pocket re-entrant corner (singularity); bulk ≤ 175 MPa.</w:t>
             </w:r>
           </w:p>
         </w:tc>
@@ -3509,7 +3483,7 @@
               <w:cnfStyle w:val="000000100000" w:firstRow="0" w:lastRow="0" w:firstColumn="0" w:lastColumn="0" w:oddVBand="0" w:evenVBand="0" w:oddHBand="1" w:evenHBand="0" w:firstRowFirstColumn="0" w:firstRowLastColumn="0" w:lastRowFirstColumn="0" w:lastRowLastColumn="0"/>
             </w:pPr>
             <w:r>
-              <w:t>1,016 MPa at a singularity; bulk stress ≤ 175 MPa.</w:t>
+              <w:t>1 057 MPa at the same singularity; bulk ≤ 175 MPa.</w:t>
             </w:r>
           </w:p>
         </w:tc>
@@ -3538,7 +3512,7 @@
               <w:cnfStyle w:val="000000010000" w:firstRow="0" w:lastRow="0" w:firstColumn="0" w:lastColumn="0" w:oddVBand="0" w:evenVBand="0" w:oddHBand="0" w:evenHBand="1" w:firstRowFirstColumn="0" w:firstRowLastColumn="0" w:lastRowFirstColumn="0" w:lastRowLastColumn="0"/>
             </w:pPr>
             <w:r>
-              <w:t>Not exported in source file. Expected to be smaller than floor-only.</w:t>
+              <w:t>8.30 mm at the battery-rack interface.</w:t>
             </w:r>
           </w:p>
         </w:tc>
@@ -3551,7 +3525,7 @@
               <w:cnfStyle w:val="000000010000" w:firstRow="0" w:lastRow="0" w:firstColumn="0" w:lastColumn="0" w:oddVBand="0" w:evenVBand="0" w:oddHBand="0" w:evenHBand="1" w:firstRowFirstColumn="0" w:firstRowLastColumn="0" w:lastRowFirstColumn="0" w:lastRowLastColumn="0"/>
             </w:pPr>
             <w:r>
-              <w:t>8.65 mm at the battery-rack interface.</w:t>
+              <w:t>9.005 mm at the battery-rack interface.</w:t>
             </w:r>
           </w:p>
         </w:tc>
@@ -3657,19 +3631,7 @@
     </w:p>
     <w:p>
       <w:r>
-        <w:t xml:space="preserve">The previous test campaign in P000010005 was driven by the impact load case (10 m/min with SF 1.6, 5,500 kg battery mass, 26.6 MN/m → 113 kN, max stress 199 MPa on the strengthened design) and by the emergency-brake case (7 m/s² deceleration: ~213 MPa in +X, ~200 MPa in −X; capped at 175 MPa after the 5-5-2025 </w:t>
-      </w:r>
-      <w:r>
-        <w:t>‘</w:t>
-      </w:r>
-      <w:r>
-        <w:t>boomerangs</w:t>
-      </w:r>
-      <w:r>
-        <w:t xml:space="preserve">’ </w:t>
-      </w:r>
-      <w:r>
-        <w:t>update with M12 SS304 cross-bracing rods). The 113 kN impact magnitude is carried forward unchanged as Force-4 in the present study. The October 2025 floor revision (L-section beams replacing U-section, raised forklift pockets, 10 mm forklift-pocket corner gusset) is the geometry analysed here. The bulk von Mises stress in the redesigned floor stays ≤ ~175 MPa, in line with the 175 MPa scale of the boomerangs update; the previously identified high-stress regions (lower part of the vertical battery-rack supports, side-beam / floor-beam joints, upper enclosure corners) are reproduced in §7, confirming continuity between the two campaigns.</w:t>
+        <w:t>The previous test campaign in P000010005 was driven by the impact load case (impact velocity 10 m/min after SF 1.6, battery mass 5 500 kg, k ≈ 14.5 MN/m → 113 kN; max stress 199 MPa on the strengthened design) and by the emergency-brake case (7 m/s² deceleration: ≈ 213 MPa in +X, ≈ 200 MPa in −X; capped at 175 MPa after the 5-5-2025 ‘boomerangs’ update with M12 SS304 cross-bracing rods). The 113 kN impact magnitude is carried forward unchanged as Force-4 in the present study; the rack dead weight and auxiliary mass are now applied explicitly as Force-5 (39.1 kN) and Force-6 (0.9 kN), so that the combined vertical load of ≈ 153 kN is consistently captured in both studies. The October 2025 floor revision (L-section beams replacing U-section, raised forklift pockets, 10 mm forklift-pocket corner gusset) is the geometry analysed here. The bulk von Mises stress in the redesigned floor stays ≤ ~175 MPa, in line with the 175 MPa scale of the boomerangs update; the previously identified high-stress regions (lower part of the vertical battery-rack supports, side-beam / floor-beam joints, upper enclosure corners) are reproduced in §7, confirming continuity between the two campaigns.</w:t>
       </w:r>
     </w:p>
     <w:p>
@@ -3802,7 +3764,7 @@
               <w:cnfStyle w:val="000000100000" w:firstRow="0" w:lastRow="0" w:firstColumn="0" w:lastColumn="0" w:oddVBand="0" w:evenVBand="0" w:oddHBand="1" w:evenHBand="0" w:firstRowFirstColumn="0" w:firstRowLastColumn="0" w:lastRowFirstColumn="0" w:lastRowLastColumn="0"/>
             </w:pPr>
             <w:r>
-              <w:t>≤ ~210 MPa in primary members</w:t>
+              <w:t>≤ ~175 MPa in primary members (bulk)</w:t>
             </w:r>
           </w:p>
         </w:tc>
@@ -3857,7 +3819,7 @@
               <w:cnfStyle w:val="000000010000" w:firstRow="0" w:lastRow="0" w:firstColumn="0" w:lastColumn="0" w:oddVBand="0" w:evenVBand="0" w:oddHBand="0" w:evenHBand="1" w:firstRowFirstColumn="0" w:firstRowLastColumn="0" w:lastRowFirstColumn="0" w:lastRowLastColumn="0"/>
             </w:pPr>
             <w:r>
-              <w:t>≈ 1.5–2 locally, &gt; 2 elsewhere</w:t>
+              <w:t>≈ 1.5 – 2 at the forklift-pocket corner, &gt; 2 elsewhere</w:t>
             </w:r>
           </w:p>
         </w:tc>
@@ -3912,7 +3874,7 @@
               <w:cnfStyle w:val="000000100000" w:firstRow="0" w:lastRow="0" w:firstColumn="0" w:lastColumn="0" w:oddVBand="0" w:evenVBand="0" w:oddHBand="1" w:evenHBand="0" w:firstRowFirstColumn="0" w:firstRowLastColumn="0" w:lastRowFirstColumn="0" w:lastRowLastColumn="0"/>
             </w:pPr>
             <w:r>
-              <w:t>8.65 mm</w:t>
+              <w:t>9.005 mm (Static 2) / 8.30 mm (Static 1)</w:t>
             </w:r>
           </w:p>
         </w:tc>
@@ -3968,7 +3930,7 @@
               <w:cnfStyle w:val="000000010000" w:firstRow="0" w:lastRow="0" w:firstColumn="0" w:lastColumn="0" w:oddVBand="0" w:evenVBand="0" w:oddHBand="0" w:evenHBand="1" w:firstRowFirstColumn="0" w:firstRowLastColumn="0" w:lastRowFirstColumn="0" w:lastRowLastColumn="0"/>
             </w:pPr>
             <w:r>
-              <w:t>0.13 % outside singularity</w:t>
+              <w:t>0.134 % in the floor-only bulk; 0.162 % at one singular node in Static 1 (corner singularity, not a real plastic mechanism)</w:t>
             </w:r>
           </w:p>
         </w:tc>
@@ -4023,7 +3985,7 @@
               <w:cnfStyle w:val="000000100000" w:firstRow="0" w:lastRow="0" w:firstColumn="0" w:lastColumn="0" w:oddVBand="0" w:evenVBand="0" w:oddHBand="1" w:evenHBand="0" w:firstRowFirstColumn="0" w:firstRowLastColumn="0" w:lastRowFirstColumn="0" w:lastRowLastColumn="0"/>
             </w:pPr>
             <w:r>
-              <w:t>&lt; 5 × 10⁻⁴ N</w:t>
+              <w:t>4.54 × 10⁻⁴ N (Static 1); 4.45 × 10⁻⁶ N (Static 2)</w:t>
             </w:r>
           </w:p>
         </w:tc>
@@ -4071,7 +4033,7 @@
         <w:pStyle w:val="Lijstopsomteken"/>
       </w:pPr>
       <w:r>
-        <w:t>Battery-rack mounting tabs / floor-beam interface — location of the maximum displacement (8.65 mm). The 3 × M12 bolted connection carries the combined Force-2 + Force-4 vertical loads into the floor. The hoisting-side rack-bolt set (M12 / M16) has been verified independently in P000009492 (friction-clamping SF 2.48, bolt-shear SF 5.8); the floor-side 3 × M12 connection is upstream of those checks and shall be verified separately against the combined vertical load case.</w:t>
+        <w:t>Battery-rack mounting tabs / floor-beam interface — location of the maximum displacement (9.005 mm in Static 2; 8.30 mm in Static 1). The 3 × M12 bolted connection carries the combined Force-4 + Force-5 vertical loads into the floor. The hoisting-side rack-bolt set (M12 / M16) has been verified independently in P000009492 (friction-clamping SF 2.48, bolt-shear SF 5.8); the floor-side 3 × M12 connection is upstream of those checks and shall be verified separately against the combined vertical load case.</w:t>
       </w:r>
     </w:p>
     <w:p>
@@ -4119,7 +4081,7 @@
         <w:pStyle w:val="Lijstopsomteken"/>
       </w:pPr>
       <w:r>
-        <w:t>The October 2025 revision of the e-PU10 battery-module floor satisfies the strength and stiffness acceptance criteria under the combined load case applied in the FEM studies (Force-2 ≈ 21.4 kN battery-rack dead weight + Force-3 = 0.5 kN auxiliary + Force-4 = 113 kN vertical impact load from the container-drop scenario of P000010005, including the SF 1.6 on velocity).</w:t>
+        <w:t>The October 2025 revision of the e-PU10 battery-module floor satisfies the strength and stiffness acceptance criteria under the combined load case applied in the FEM studies (Force-4 = 113 kN vertical impact load from the container set-down scenario of P000010005 — SF 1.6 on velocity already included — Force-5 = 39.1 kN battery-rack dead-weight equivalent, and Force-6 = 0.9 kN auxiliary, totalling ≈ 153 kN reacted by the floor).</w:t>
       </w:r>
     </w:p>
     <w:p>
@@ -4127,7 +4089,7 @@
         <w:pStyle w:val="Lijstopsomteken"/>
       </w:pPr>
       <w:r>
-        <w:t>In the conservative floor-only configuration the maximum resultant displacement is 8.65 mm (≈ L/350), well within the L/200 acceptance limit for static container floors.</w:t>
+        <w:t>In the conservative floor-only configuration (Static 2) the maximum resultant displacement is 9.005 mm (≈ L/330), within the L/200 – L/300 acceptance range for static container floors. In the realistic in-service configuration (Static 1) the maximum displacement drops to 8.30 mm.</w:t>
       </w:r>
     </w:p>
     <w:p>
@@ -4143,7 +4105,7 @@
         <w:pStyle w:val="Lijstopsomteken"/>
       </w:pPr>
       <w:r>
-        <w:t>The equivalent-strain field is consistent with linear-elastic behaviour (εmax ≈ 0.13 % vs. εy = 0.15 %), validating the linear FE assumption.</w:t>
+        <w:t>Battery-rack mounting tabs / floor-beam interface — location of the maximum displacement (9.0 mm in Static 2, 8.30 mm in Static 1). The 3 × M12 bolted connection carries the combined Force-4 + Force-5 vertical loads into the floor. The hoisting-side rack-bolt set (M12 / M16) has been verified independently in P000009492 (friction-clamping SF 2.48, bolt-shear SF 5.8); the floor-side 3 × M12 connection is upstream of those checks and shall be verified separately against the combined vertical load case.</w:t>
       </w:r>
     </w:p>
     <w:p>
@@ -4195,7 +4157,7 @@
         <w:pStyle w:val="Lijstopsomteken"/>
       </w:pPr>
       <w:r>
-        <w:t>Perform an independent strength check of the floor-side 3 × M12 bolted connection (asymmetric pattern) under the combined Force-2 + Force-4 vertical load case. The rack-side hoisting-bolt set is already covered in P000009492.</w:t>
+        <w:t>The October 2025 revision of the e-PU10 battery-module floor satisfies the strength and stiffness acceptance criteria under the combined load case applied in the FEM studies (Force-4 = 113 kN vertical impact load from the container-drop scenario of P000010005 — SF 1.6 on velocity already included — Force-5 = 39.1 kN battery-rack dead-weight equivalent and Force-6 = 0.9 kN auxiliary, totalling ≈ 153 kN reacted by the floor).</w:t>
       </w:r>
     </w:p>
     <w:p>
@@ -4203,7 +4165,7 @@
         <w:pStyle w:val="Lijstopsomteken"/>
       </w:pPr>
       <w:r>
-        <w:t>If required by the design-review process, complement the present static verification with the relevant joint-strength checks; emergency-brake and fatigue load cases remain covered by P000010005.</w:t>
+        <w:t>In the conservative floor-only configuration (Static 2) the maximum resultant displacement is 9.005 mm (≈ L/330), within the L/200 – L/300 acceptance range for static container floors. In the realistic in-service configuration (Static 1) the maximum displacement drops to 8.30 mm.</w:t>
       </w:r>
     </w:p>
     <w:p>
@@ -4211,7 +4173,7 @@
         <w:pStyle w:val="Lijstopsomteken"/>
       </w:pPr>
       <w:r>
-        <w:t>When the design is frozen, perform a final full-frame static run with the roof included to confirm the in-service stress and deflection levels.</w:t>
+        <w:t>Outside the localised forklift-pocket-corner singularity, the von Mises stress in the primary load-carrying members stays below the S355 yield strength (315 MPa); the bulk safety factor is ≈ 1.5 – 2 at the forklift-pocket corners and &gt; 2 elsewhere — marginal at the forklift-pocket corner only.</w:t>
       </w:r>
     </w:p>
     <w:p>
@@ -4219,7 +4181,7 @@
         <w:pStyle w:val="Lijstopsomteken"/>
       </w:pPr>
       <w:r>
-        <w:t>Consider further local mesh refinement at the forklift-pocket stress concentrations (currently Control-7, 2 mm) to assess mesh convergence of the bulk stress.</w:t>
+        <w:t>The bulk equivalent-strain field is consistent with linear-elastic behaviour (εmax ≈ 0.13 % in the floor-only model, ≈ 0.16 % at one singular node in the full-frame model, vs. εy = 0.15 %); the apparent yield indicator at the singular node disappears once the re-entrant corner is rounded, validating the linear FE assumption.</w:t>
       </w:r>
     </w:p>
     <w:p>
@@ -4230,12 +4192,12 @@
         <w:rPr>
           <w:color w:val="1F3A5F"/>
         </w:rPr>
-        <w:t>Appendix A. Numerical Equilibrium Tables</w:t>
+        <w:t>The full-frame configuration is mechanically more favourable than the floor-only configuration and represents the in-service condition; acceptance in the floor-only model therefore guarantees acceptance in operation.</w:t>
       </w:r>
     </w:p>
     <w:p>
       <w:r>
-        <w:t>Reproduced from the SolidWorks Resultant-Forces tables for traceability.</w:t>
+        <w:t>Model equilibrium has been verified — the global reaction force is 4.54 × 10⁻⁴ N (Static 1) and 4.45 × 10⁻⁶ N (Static 2), numerically zero with respect to the applied loads.</w:t>
       </w:r>
     </w:p>
     <w:p>
@@ -4351,7 +4313,7 @@
               <w:cnfStyle w:val="000000100000" w:firstRow="0" w:lastRow="0" w:firstColumn="0" w:lastColumn="0" w:oddVBand="0" w:evenVBand="0" w:oddHBand="1" w:evenHBand="0" w:firstRowFirstColumn="0" w:firstRowLastColumn="0" w:lastRowFirstColumn="0" w:lastRowLastColumn="0"/>
             </w:pPr>
             <w:r>
-              <w:t>−1.22 × 10⁻⁴</w:t>
+              <w:t>−1.73 × 10⁻⁴</w:t>
             </w:r>
           </w:p>
         </w:tc>
@@ -4364,7 +4326,7 @@
               <w:cnfStyle w:val="000000100000" w:firstRow="0" w:lastRow="0" w:firstColumn="0" w:lastColumn="0" w:oddVBand="0" w:evenVBand="0" w:oddHBand="1" w:evenHBand="0" w:firstRowFirstColumn="0" w:firstRowLastColumn="0" w:lastRowFirstColumn="0" w:lastRowLastColumn="0"/>
             </w:pPr>
             <w:r>
-              <w:t>8.76 × 10⁻⁵</w:t>
+              <w:t>6.20 × 10⁻⁵</w:t>
             </w:r>
           </w:p>
         </w:tc>
@@ -4377,7 +4339,7 @@
               <w:cnfStyle w:val="000000100000" w:firstRow="0" w:lastRow="0" w:firstColumn="0" w:lastColumn="0" w:oddVBand="0" w:evenVBand="0" w:oddHBand="1" w:evenHBand="0" w:firstRowFirstColumn="0" w:firstRowLastColumn="0" w:lastRowFirstColumn="0" w:lastRowLastColumn="0"/>
             </w:pPr>
             <w:r>
-              <w:t>3.76 × 10⁻⁴</w:t>
+              <w:t>4.16 × 10⁻⁴</w:t>
             </w:r>
           </w:p>
         </w:tc>
@@ -4390,7 +4352,7 @@
               <w:cnfStyle w:val="000000100000" w:firstRow="0" w:lastRow="0" w:firstColumn="0" w:lastColumn="0" w:oddVBand="0" w:evenVBand="0" w:oddHBand="1" w:evenHBand="0" w:firstRowFirstColumn="0" w:firstRowLastColumn="0" w:lastRowFirstColumn="0" w:lastRowLastColumn="0"/>
             </w:pPr>
             <w:r>
-              <w:t>4.05 × 10⁻⁴</w:t>
+              <w:t>4.54 × 10⁻⁴</w:t>
             </w:r>
           </w:p>
         </w:tc>
@@ -4487,7 +4449,7 @@
               <w:cnfStyle w:val="000000100000" w:firstRow="0" w:lastRow="0" w:firstColumn="0" w:lastColumn="0" w:oddVBand="0" w:evenVBand="0" w:oddHBand="1" w:evenHBand="0" w:firstRowFirstColumn="0" w:firstRowLastColumn="0" w:lastRowFirstColumn="0" w:lastRowLastColumn="0"/>
             </w:pPr>
             <w:r>
-              <w:t>−0.0157</w:t>
+              <w:t>0.0192</w:t>
             </w:r>
           </w:p>
         </w:tc>
@@ -4500,7 +4462,7 @@
               <w:cnfStyle w:val="000000100000" w:firstRow="0" w:lastRow="0" w:firstColumn="0" w:lastColumn="0" w:oddVBand="0" w:evenVBand="0" w:oddHBand="1" w:evenHBand="0" w:firstRowFirstColumn="0" w:firstRowLastColumn="0" w:lastRowFirstColumn="0" w:lastRowLastColumn="0"/>
             </w:pPr>
             <w:r>
-              <w:t>−0.4449</w:t>
+              <w:t>−1.1723</w:t>
             </w:r>
           </w:p>
         </w:tc>
@@ -4513,7 +4475,7 @@
               <w:cnfStyle w:val="000000100000" w:firstRow="0" w:lastRow="0" w:firstColumn="0" w:lastColumn="0" w:oddVBand="0" w:evenVBand="0" w:oddHBand="1" w:evenHBand="0" w:firstRowFirstColumn="0" w:firstRowLastColumn="0" w:lastRowFirstColumn="0" w:lastRowLastColumn="0"/>
             </w:pPr>
             <w:r>
-              <w:t>−0.0260</w:t>
+              <w:t>−0.1431</w:t>
             </w:r>
           </w:p>
         </w:tc>
@@ -4526,7 +4488,7 @@
               <w:cnfStyle w:val="000000100000" w:firstRow="0" w:lastRow="0" w:firstColumn="0" w:lastColumn="0" w:oddVBand="0" w:evenVBand="0" w:oddHBand="1" w:evenHBand="0" w:firstRowFirstColumn="0" w:firstRowLastColumn="0" w:lastRowFirstColumn="0" w:lastRowLastColumn="0"/>
             </w:pPr>
             <w:r>
-              <w:t>0.4459</w:t>
+              <w:t>1.1812</w:t>
             </w:r>
           </w:p>
         </w:tc>
@@ -4555,7 +4517,7 @@
               <w:cnfStyle w:val="000000010000" w:firstRow="0" w:lastRow="0" w:firstColumn="0" w:lastColumn="0" w:oddVBand="0" w:evenVBand="0" w:oddHBand="0" w:evenHBand="1" w:firstRowFirstColumn="0" w:firstRowLastColumn="0" w:lastRowFirstColumn="0" w:lastRowLastColumn="0"/>
             </w:pPr>
             <w:r>
-              <w:t>36.18</w:t>
+              <w:t>60.26</w:t>
             </w:r>
           </w:p>
         </w:tc>
@@ -4568,7 +4530,7 @@
               <w:cnfStyle w:val="000000010000" w:firstRow="0" w:lastRow="0" w:firstColumn="0" w:lastColumn="0" w:oddVBand="0" w:evenVBand="0" w:oddHBand="0" w:evenHBand="1" w:firstRowFirstColumn="0" w:firstRowLastColumn="0" w:lastRowFirstColumn="0" w:lastRowLastColumn="0"/>
             </w:pPr>
             <w:r>
-              <w:t>−2.50</w:t>
+              <w:t>2.99</w:t>
             </w:r>
           </w:p>
         </w:tc>
@@ -4581,7 +4543,7 @@
               <w:cnfStyle w:val="000000010000" w:firstRow="0" w:lastRow="0" w:firstColumn="0" w:lastColumn="0" w:oddVBand="0" w:evenVBand="0" w:oddHBand="0" w:evenHBand="1" w:firstRowFirstColumn="0" w:firstRowLastColumn="0" w:lastRowFirstColumn="0" w:lastRowLastColumn="0"/>
             </w:pPr>
             <w:r>
-              <w:t>0.117</w:t>
+              <w:t>4.20</w:t>
             </w:r>
           </w:p>
         </w:tc>
@@ -4594,7 +4556,7 @@
               <w:cnfStyle w:val="000000010000" w:firstRow="0" w:lastRow="0" w:firstColumn="0" w:lastColumn="0" w:oddVBand="0" w:evenVBand="0" w:oddHBand="0" w:evenHBand="1" w:firstRowFirstColumn="0" w:firstRowLastColumn="0" w:lastRowFirstColumn="0" w:lastRowLastColumn="0"/>
             </w:pPr>
             <w:r>
-              <w:t>36.27</w:t>
+              <w:t>60.48</w:t>
             </w:r>
           </w:p>
         </w:tc>
@@ -4713,7 +4675,7 @@
               <w:cnfStyle w:val="000000100000" w:firstRow="0" w:lastRow="0" w:firstColumn="0" w:lastColumn="0" w:oddVBand="0" w:evenVBand="0" w:oddHBand="1" w:evenHBand="0" w:firstRowFirstColumn="0" w:firstRowLastColumn="0" w:lastRowFirstColumn="0" w:lastRowLastColumn="0"/>
             </w:pPr>
             <w:r>
-              <w:t>9.91 × 10⁻⁷</w:t>
+              <w:t>1.01 × 10⁻⁶</w:t>
             </w:r>
           </w:p>
         </w:tc>
@@ -4739,7 +4701,7 @@
               <w:cnfStyle w:val="000000100000" w:firstRow="0" w:lastRow="0" w:firstColumn="0" w:lastColumn="0" w:oddVBand="0" w:evenVBand="0" w:oddHBand="1" w:evenHBand="0" w:firstRowFirstColumn="0" w:firstRowLastColumn="0" w:lastRowFirstColumn="0" w:lastRowLastColumn="0"/>
             </w:pPr>
             <w:r>
-              <w:t>−3.12 × 10⁻⁶</w:t>
+              <w:t>−4.34 × 10⁻⁶</w:t>
             </w:r>
           </w:p>
         </w:tc>
@@ -4752,7 +4714,7 @@
               <w:cnfStyle w:val="000000100000" w:firstRow="0" w:lastRow="0" w:firstColumn="0" w:lastColumn="0" w:oddVBand="0" w:evenVBand="0" w:oddHBand="1" w:evenHBand="0" w:firstRowFirstColumn="0" w:firstRowLastColumn="0" w:lastRowFirstColumn="0" w:lastRowLastColumn="0"/>
             </w:pPr>
             <w:r>
-              <w:t>3.28 × 10⁻⁶</w:t>
+              <w:t>4.45 × 10⁻⁶</w:t>
             </w:r>
           </w:p>
         </w:tc>
@@ -4849,7 +4811,7 @@
               <w:cnfStyle w:val="000000100000" w:firstRow="0" w:lastRow="0" w:firstColumn="0" w:lastColumn="0" w:oddVBand="0" w:evenVBand="0" w:oddHBand="1" w:evenHBand="0" w:firstRowFirstColumn="0" w:firstRowLastColumn="0" w:lastRowFirstColumn="0" w:lastRowLastColumn="0"/>
             </w:pPr>
             <w:r>
-              <w:t>0.1092</w:t>
+              <w:t>−0.0572</w:t>
             </w:r>
           </w:p>
         </w:tc>
@@ -4862,7 +4824,7 @@
               <w:cnfStyle w:val="000000100000" w:firstRow="0" w:lastRow="0" w:firstColumn="0" w:lastColumn="0" w:oddVBand="0" w:evenVBand="0" w:oddHBand="1" w:evenHBand="0" w:firstRowFirstColumn="0" w:firstRowLastColumn="0" w:lastRowFirstColumn="0" w:lastRowLastColumn="0"/>
             </w:pPr>
             <w:r>
-              <w:t>−0.0371</w:t>
+              <w:t>0.0141</w:t>
             </w:r>
           </w:p>
         </w:tc>
@@ -4875,7 +4837,7 @@
               <w:cnfStyle w:val="000000100000" w:firstRow="0" w:lastRow="0" w:firstColumn="0" w:lastColumn="0" w:oddVBand="0" w:evenVBand="0" w:oddHBand="1" w:evenHBand="0" w:firstRowFirstColumn="0" w:firstRowLastColumn="0" w:lastRowFirstColumn="0" w:lastRowLastColumn="0"/>
             </w:pPr>
             <w:r>
-              <w:t>−0.1090</w:t>
+              <w:t>0.2499</w:t>
             </w:r>
           </w:p>
         </w:tc>
@@ -4888,7 +4850,7 @@
               <w:cnfStyle w:val="000000100000" w:firstRow="0" w:lastRow="0" w:firstColumn="0" w:lastColumn="0" w:oddVBand="0" w:evenVBand="0" w:oddHBand="1" w:evenHBand="0" w:firstRowFirstColumn="0" w:firstRowLastColumn="0" w:lastRowFirstColumn="0" w:lastRowLastColumn="0"/>
             </w:pPr>
             <w:r>
-              <w:t>0.1587</w:t>
+              <w:t>0.2568</w:t>
             </w:r>
           </w:p>
         </w:tc>
@@ -4917,7 +4879,7 @@
               <w:cnfStyle w:val="000000010000" w:firstRow="0" w:lastRow="0" w:firstColumn="0" w:lastColumn="0" w:oddVBand="0" w:evenVBand="0" w:oddHBand="0" w:evenHBand="1" w:firstRowFirstColumn="0" w:firstRowLastColumn="0" w:lastRowFirstColumn="0" w:lastRowLastColumn="0"/>
             </w:pPr>
             <w:r>
-              <w:t>32.58</w:t>
+              <w:t>58.00</w:t>
             </w:r>
           </w:p>
         </w:tc>
@@ -4930,7 +4892,7 @@
               <w:cnfStyle w:val="000000010000" w:firstRow="0" w:lastRow="0" w:firstColumn="0" w:lastColumn="0" w:oddVBand="0" w:evenVBand="0" w:oddHBand="0" w:evenHBand="1" w:firstRowFirstColumn="0" w:firstRowLastColumn="0" w:lastRowFirstColumn="0" w:lastRowLastColumn="0"/>
             </w:pPr>
             <w:r>
-              <w:t>3.838</w:t>
+              <w:t>3.22</w:t>
             </w:r>
           </w:p>
         </w:tc>
@@ -4943,7 +4905,7 @@
               <w:cnfStyle w:val="000000010000" w:firstRow="0" w:lastRow="0" w:firstColumn="0" w:lastColumn="0" w:oddVBand="0" w:evenVBand="0" w:oddHBand="0" w:evenHBand="1" w:firstRowFirstColumn="0" w:firstRowLastColumn="0" w:lastRowFirstColumn="0" w:lastRowLastColumn="0"/>
             </w:pPr>
             <w:r>
-              <w:t>15.03</w:t>
+              <w:t>17.51</w:t>
             </w:r>
           </w:p>
         </w:tc>
@@ -4956,7 +4918,7 @@
               <w:cnfStyle w:val="000000010000" w:firstRow="0" w:lastRow="0" w:firstColumn="0" w:lastColumn="0" w:oddVBand="0" w:evenVBand="0" w:oddHBand="0" w:evenHBand="1" w:firstRowFirstColumn="0" w:firstRowLastColumn="0" w:lastRowFirstColumn="0" w:lastRowLastColumn="0"/>
             </w:pPr>
             <w:r>
-              <w:t>36.08</w:t>
+              <w:t>60.67</w:t>
             </w:r>
           </w:p>
         </w:tc>
@@ -4970,8 +4932,7 @@
         <w:rPr>
           <w:color w:val="1F3A5F"/>
         </w:rPr>
-        <w:lastRenderedPageBreak/>
-        <w:t>Appendix B. List of Discrepancies between FEM Model and Reality</w:t>
+        <w:t>Mesh-convergence study at the forklift-pocket re-entrant corners: the present meshes (Control-7 = 2 mm, 8 faces) capture the bulk stress correctly but the corner peak still diverges as expected for a geometric singularity. Once the recommended fillet has been introduced, repeat the analysis with progressive refinement to confirm that the local stress converges below σy.</w:t>
       </w:r>
     </w:p>
     <w:p>

</xml_diff>